<commit_message>
feat: organized the file into folder
</commit_message>
<xml_diff>
--- a/Leetcode.docx
+++ b/Leetcode.docx
@@ -96,15 +96,7 @@
         <w:ind w:left="720"/>
       </w:pPr>
       <w:r>
-        <w:t xml:space="preserve">The constraint is </w:t>
-      </w:r>
-      <w:proofErr w:type="gramStart"/>
-      <w:r>
-        <w:t>O(</w:t>
-      </w:r>
-      <w:proofErr w:type="gramEnd"/>
-      <w:r>
-        <w:t>1)</w:t>
+        <w:t>The constraint is O(1)</w:t>
       </w:r>
     </w:p>
     <w:p>
@@ -217,13 +209,8 @@
       <w:r>
         <w:t xml:space="preserve"> if it is less than </w:t>
       </w:r>
-      <w:proofErr w:type="gramStart"/>
-      <w:r>
-        <w:t>his[</w:t>
-      </w:r>
-      <w:proofErr w:type="gramEnd"/>
-      <w:r>
-        <w:t>-1]</w:t>
+      <w:r>
+        <w:t>his[-1]</w:t>
       </w:r>
     </w:p>
     <w:p>
@@ -254,13 +241,8 @@
       <w:r>
         <w:t xml:space="preserve">Elif it was equal or greater than </w:t>
       </w:r>
-      <w:proofErr w:type="gramStart"/>
-      <w:r>
-        <w:t>his[</w:t>
-      </w:r>
-      <w:proofErr w:type="gramEnd"/>
-      <w:r>
-        <w:t>-1]</w:t>
+      <w:r>
+        <w:t>his[-1]</w:t>
       </w:r>
     </w:p>
     <w:p>
@@ -276,19 +258,116 @@
         <w:t>Append the</w:t>
       </w:r>
       <w:r>
+        <w:t xml:space="preserve"> his[-1]</w:t>
+      </w:r>
+      <w:r>
+        <w:t xml:space="preserve"> to the his </w:t>
+      </w:r>
+    </w:p>
+    <w:p>
+      <w:pPr>
+        <w:pStyle w:val="ListBullet"/>
+        <w:tabs>
+          <w:tab w:val="clear" w:pos="360"/>
+          <w:tab w:val="num" w:pos="720"/>
+        </w:tabs>
+        <w:ind w:left="720"/>
+      </w:pPr>
+      <w:r>
+        <w:t>At Pop</w:t>
+      </w:r>
+    </w:p>
+    <w:p>
+      <w:pPr>
+        <w:pStyle w:val="ListBullet"/>
+        <w:tabs>
+          <w:tab w:val="clear" w:pos="360"/>
+          <w:tab w:val="num" w:pos="1080"/>
+        </w:tabs>
+        <w:ind w:left="1080"/>
+      </w:pPr>
+      <w:r>
+        <w:t>Remove the last element from stack</w:t>
+      </w:r>
+    </w:p>
+    <w:p>
+      <w:pPr>
+        <w:pStyle w:val="ListBullet"/>
+        <w:tabs>
+          <w:tab w:val="clear" w:pos="360"/>
+          <w:tab w:val="num" w:pos="1080"/>
+        </w:tabs>
+        <w:ind w:left="1080"/>
+      </w:pPr>
+      <w:r>
+        <w:t>Remove the last element from his</w:t>
+      </w:r>
+    </w:p>
+    <w:p>
+      <w:pPr>
+        <w:pStyle w:val="ListBullet"/>
+        <w:tabs>
+          <w:tab w:val="clear" w:pos="360"/>
+          <w:tab w:val="num" w:pos="720"/>
+        </w:tabs>
+        <w:ind w:left="720"/>
+      </w:pPr>
+      <w:r>
+        <w:t xml:space="preserve">At top </w:t>
+      </w:r>
+    </w:p>
+    <w:p>
+      <w:pPr>
+        <w:pStyle w:val="ListBullet"/>
+        <w:tabs>
+          <w:tab w:val="clear" w:pos="360"/>
+          <w:tab w:val="num" w:pos="1080"/>
+        </w:tabs>
+        <w:ind w:left="1080"/>
+      </w:pPr>
+      <w:r>
+        <w:t>Return the last element from the main stack without removing</w:t>
+      </w:r>
+    </w:p>
+    <w:p>
+      <w:pPr>
+        <w:pStyle w:val="ListBullet"/>
+        <w:tabs>
+          <w:tab w:val="clear" w:pos="360"/>
+          <w:tab w:val="num" w:pos="720"/>
+        </w:tabs>
+        <w:ind w:left="720"/>
+      </w:pPr>
+      <w:r>
+        <w:t>At getmini</w:t>
+      </w:r>
+    </w:p>
+    <w:p>
+      <w:pPr>
+        <w:pStyle w:val="ListBullet"/>
+        <w:tabs>
+          <w:tab w:val="clear" w:pos="360"/>
+          <w:tab w:val="num" w:pos="1080"/>
+        </w:tabs>
+        <w:ind w:left="1080"/>
+      </w:pPr>
+      <w:r>
+        <w:t>Return the his[-1]</w:t>
+      </w:r>
+      <w:r>
+        <w:t>.</w:t>
+      </w:r>
+    </w:p>
+    <w:p>
+      <w:pPr>
+        <w:pStyle w:val="Heading3"/>
+      </w:pPr>
+      <w:r>
+        <w:t>Edge Cases:</w:t>
+      </w:r>
+      <w:r>
         <w:t xml:space="preserve"> </w:t>
       </w:r>
-      <w:proofErr w:type="gramStart"/>
-      <w:r>
-        <w:t>his[</w:t>
-      </w:r>
-      <w:proofErr w:type="gramEnd"/>
-      <w:r>
-        <w:t>-1]</w:t>
-      </w:r>
-      <w:r>
-        <w:t xml:space="preserve"> to the his </w:t>
-      </w:r>
     </w:p>
     <w:p>
       <w:pPr>
@@ -300,33 +379,7 @@
         <w:ind w:left="720"/>
       </w:pPr>
       <w:r>
-        <w:t>At Pop</w:t>
-      </w:r>
-    </w:p>
-    <w:p>
-      <w:pPr>
-        <w:pStyle w:val="ListBullet"/>
-        <w:tabs>
-          <w:tab w:val="clear" w:pos="360"/>
-          <w:tab w:val="num" w:pos="1080"/>
-        </w:tabs>
-        <w:ind w:left="1080"/>
-      </w:pPr>
-      <w:r>
-        <w:t>Remove the last element from stack</w:t>
-      </w:r>
-    </w:p>
-    <w:p>
-      <w:pPr>
-        <w:pStyle w:val="ListBullet"/>
-        <w:tabs>
-          <w:tab w:val="clear" w:pos="360"/>
-          <w:tab w:val="num" w:pos="1080"/>
-        </w:tabs>
-        <w:ind w:left="1080"/>
-      </w:pPr>
-      <w:r>
-        <w:t>Remove the last element from his</w:t>
+        <w:t>Pop on empty stack.</w:t>
       </w:r>
     </w:p>
     <w:p>
@@ -339,104 +392,7 @@
         <w:ind w:left="720"/>
       </w:pPr>
       <w:r>
-        <w:t xml:space="preserve">At top </w:t>
-      </w:r>
-    </w:p>
-    <w:p>
-      <w:pPr>
-        <w:pStyle w:val="ListBullet"/>
-        <w:tabs>
-          <w:tab w:val="clear" w:pos="360"/>
-          <w:tab w:val="num" w:pos="1080"/>
-        </w:tabs>
-        <w:ind w:left="1080"/>
-      </w:pPr>
-      <w:r>
-        <w:t>Return the last element from the main stack without removing</w:t>
-      </w:r>
-    </w:p>
-    <w:p>
-      <w:pPr>
-        <w:pStyle w:val="ListBullet"/>
-        <w:tabs>
-          <w:tab w:val="clear" w:pos="360"/>
-          <w:tab w:val="num" w:pos="720"/>
-        </w:tabs>
-        <w:ind w:left="720"/>
-      </w:pPr>
-      <w:r>
-        <w:t xml:space="preserve">At </w:t>
-      </w:r>
-      <w:proofErr w:type="spellStart"/>
-      <w:r>
-        <w:t>getmini</w:t>
-      </w:r>
-      <w:proofErr w:type="spellEnd"/>
-    </w:p>
-    <w:p>
-      <w:pPr>
-        <w:pStyle w:val="ListBullet"/>
-        <w:tabs>
-          <w:tab w:val="clear" w:pos="360"/>
-          <w:tab w:val="num" w:pos="1080"/>
-        </w:tabs>
-        <w:ind w:left="1080"/>
-      </w:pPr>
-      <w:r>
-        <w:t xml:space="preserve">Return the </w:t>
-      </w:r>
-      <w:proofErr w:type="gramStart"/>
-      <w:r>
-        <w:t>his[</w:t>
-      </w:r>
-      <w:proofErr w:type="gramEnd"/>
-      <w:r>
-        <w:t>-1]</w:t>
-      </w:r>
-      <w:r>
-        <w:t>.</w:t>
-      </w:r>
-    </w:p>
-    <w:p>
-      <w:pPr>
-        <w:pStyle w:val="Heading3"/>
-      </w:pPr>
-      <w:r>
-        <w:t>Edge Cases:</w:t>
-      </w:r>
-      <w:r>
-        <w:t xml:space="preserve"> </w:t>
-      </w:r>
-    </w:p>
-    <w:p>
-      <w:pPr>
-        <w:pStyle w:val="ListBullet"/>
-        <w:tabs>
-          <w:tab w:val="clear" w:pos="360"/>
-          <w:tab w:val="num" w:pos="720"/>
-        </w:tabs>
-        <w:ind w:left="720"/>
-      </w:pPr>
-      <w:r>
-        <w:t>Pop on empty stack.</w:t>
-      </w:r>
-    </w:p>
-    <w:p>
-      <w:pPr>
-        <w:pStyle w:val="ListBullet"/>
-        <w:tabs>
-          <w:tab w:val="clear" w:pos="360"/>
-          <w:tab w:val="num" w:pos="720"/>
-        </w:tabs>
-        <w:ind w:left="720"/>
-      </w:pPr>
-      <w:proofErr w:type="spellStart"/>
-      <w:r>
-        <w:t>Getmini</w:t>
-      </w:r>
-      <w:proofErr w:type="spellEnd"/>
-      <w:r>
-        <w:t xml:space="preserve"> on empty stack.</w:t>
+        <w:t>Getmini on empty stack.</w:t>
       </w:r>
     </w:p>
     <w:p>
@@ -544,15 +500,7 @@
     </w:p>
     <w:p>
       <w:r>
-        <w:t xml:space="preserve">Avoid calculating the days one by one instead run one forward pass </w:t>
-      </w:r>
-      <w:proofErr w:type="gramStart"/>
-      <w:r>
-        <w:t>loop(</w:t>
-      </w:r>
-      <w:proofErr w:type="gramEnd"/>
-      <w:r>
-        <w:t>for loop) and calculate all the previous day present in stack while getting a large value</w:t>
+        <w:t>Avoid calculating the days one by one instead run one forward pass loop(for loop) and calculate all the previous day present in stack while getting a large value</w:t>
       </w:r>
     </w:p>
     <w:p>
@@ -781,23 +729,7 @@
         <w:pStyle w:val="ListBullet"/>
       </w:pPr>
       <w:r>
-        <w:t xml:space="preserve">It’s </w:t>
-      </w:r>
-      <w:proofErr w:type="gramStart"/>
-      <w:r>
-        <w:t>give</w:t>
-      </w:r>
-      <w:proofErr w:type="gramEnd"/>
-      <w:r>
-        <w:t xml:space="preserve"> the class of root like you have the left right value you just need to calculate as shown in </w:t>
-      </w:r>
-      <w:proofErr w:type="gramStart"/>
-      <w:r>
-        <w:t>example(</w:t>
-      </w:r>
-      <w:proofErr w:type="gramEnd"/>
-      <w:r>
-        <w:t>1.1)</w:t>
+        <w:t>It’s give the class of root like you have the left right value you just need to calculate as shown in example(1.1)</w:t>
       </w:r>
     </w:p>
     <w:p>
@@ -841,35 +773,14 @@
         </w:tabs>
         <w:ind w:left="1080"/>
       </w:pPr>
-      <w:proofErr w:type="gramStart"/>
       <w:r>
         <w:t>Ex</w:t>
       </w:r>
       <w:r>
-        <w:t>(</w:t>
-      </w:r>
-      <w:proofErr w:type="gramEnd"/>
-      <w:r>
-        <w:t>1.1)</w:t>
-      </w:r>
-      <w:r>
-        <w:t xml:space="preserve">: </w:t>
-      </w:r>
-      <w:r>
-        <w:t xml:space="preserve">root = </w:t>
-      </w:r>
-      <w:proofErr w:type="spellStart"/>
-      <w:proofErr w:type="gramStart"/>
-      <w:r>
-        <w:t>TreeNode</w:t>
-      </w:r>
-      <w:proofErr w:type="spellEnd"/>
-      <w:r>
-        <w:t>(</w:t>
-      </w:r>
-      <w:proofErr w:type="gramEnd"/>
-      <w:r>
-        <w:t>3)</w:t>
+        <w:t>(1.1)</w:t>
+      </w:r>
+      <w:r>
+        <w:t>: root = TreeNode(3)</w:t>
       </w:r>
     </w:p>
     <w:p>
@@ -881,28 +792,8 @@
         </w:numPr>
         <w:ind w:left="720" w:firstLine="360"/>
       </w:pPr>
-      <w:proofErr w:type="spellStart"/>
-      <w:proofErr w:type="gramStart"/>
-      <w:r>
-        <w:t>root.left</w:t>
-      </w:r>
-      <w:proofErr w:type="spellEnd"/>
-      <w:proofErr w:type="gramEnd"/>
-      <w:r>
-        <w:t xml:space="preserve"> = </w:t>
-      </w:r>
-      <w:proofErr w:type="spellStart"/>
-      <w:proofErr w:type="gramStart"/>
-      <w:r>
-        <w:t>TreeNode</w:t>
-      </w:r>
-      <w:proofErr w:type="spellEnd"/>
-      <w:r>
-        <w:t>(</w:t>
-      </w:r>
-      <w:proofErr w:type="gramEnd"/>
-      <w:r>
-        <w:t>9)</w:t>
+      <w:r>
+        <w:t>root.left = TreeNode(9)</w:t>
       </w:r>
     </w:p>
     <w:p>
@@ -914,28 +805,8 @@
         </w:numPr>
         <w:ind w:left="720" w:firstLine="360"/>
       </w:pPr>
-      <w:proofErr w:type="spellStart"/>
-      <w:proofErr w:type="gramStart"/>
-      <w:r>
-        <w:t>root.right</w:t>
-      </w:r>
-      <w:proofErr w:type="spellEnd"/>
-      <w:proofErr w:type="gramEnd"/>
-      <w:r>
-        <w:t xml:space="preserve"> = </w:t>
-      </w:r>
-      <w:proofErr w:type="spellStart"/>
-      <w:proofErr w:type="gramStart"/>
-      <w:r>
-        <w:t>TreeNode</w:t>
-      </w:r>
-      <w:proofErr w:type="spellEnd"/>
-      <w:r>
-        <w:t>(</w:t>
-      </w:r>
-      <w:proofErr w:type="gramEnd"/>
-      <w:r>
-        <w:t>20)</w:t>
+      <w:r>
+        <w:t>root.right = TreeNode(20)</w:t>
       </w:r>
     </w:p>
     <w:p>
@@ -947,31 +818,8 @@
         </w:numPr>
         <w:ind w:left="720" w:firstLine="360"/>
       </w:pPr>
-      <w:proofErr w:type="spellStart"/>
-      <w:proofErr w:type="gramStart"/>
-      <w:r>
-        <w:t>root.right</w:t>
-      </w:r>
-      <w:proofErr w:type="gramEnd"/>
-      <w:r>
-        <w:t>.left</w:t>
-      </w:r>
-      <w:proofErr w:type="spellEnd"/>
-      <w:r>
-        <w:t xml:space="preserve"> = </w:t>
-      </w:r>
-      <w:proofErr w:type="spellStart"/>
-      <w:proofErr w:type="gramStart"/>
-      <w:r>
-        <w:t>TreeNode</w:t>
-      </w:r>
-      <w:proofErr w:type="spellEnd"/>
-      <w:r>
-        <w:t>(</w:t>
-      </w:r>
-      <w:proofErr w:type="gramEnd"/>
-      <w:r>
-        <w:t>15)</w:t>
+      <w:r>
+        <w:t>root.right.left = TreeNode(15)</w:t>
       </w:r>
     </w:p>
     <w:p>
@@ -983,31 +831,8 @@
         </w:numPr>
         <w:ind w:left="720" w:firstLine="360"/>
       </w:pPr>
-      <w:proofErr w:type="spellStart"/>
-      <w:proofErr w:type="gramStart"/>
-      <w:r>
-        <w:t>root.right</w:t>
-      </w:r>
-      <w:proofErr w:type="gramEnd"/>
-      <w:r>
-        <w:t>.right</w:t>
-      </w:r>
-      <w:proofErr w:type="spellEnd"/>
-      <w:r>
-        <w:t xml:space="preserve"> = </w:t>
-      </w:r>
-      <w:proofErr w:type="spellStart"/>
-      <w:proofErr w:type="gramStart"/>
-      <w:r>
-        <w:t>TreeNode</w:t>
-      </w:r>
-      <w:proofErr w:type="spellEnd"/>
-      <w:r>
-        <w:t>(</w:t>
-      </w:r>
-      <w:proofErr w:type="gramEnd"/>
-      <w:r>
-        <w:t>7)</w:t>
+      <w:r>
+        <w:t>root.right.right = TreeNode(7)</w:t>
       </w:r>
     </w:p>
     <w:p>
@@ -1071,31 +896,8 @@
         </w:tabs>
         <w:ind w:left="1440"/>
       </w:pPr>
-      <w:proofErr w:type="spellStart"/>
-      <w:r>
-        <w:t>Leftdepth</w:t>
-      </w:r>
-      <w:proofErr w:type="spellEnd"/>
-      <w:r>
-        <w:t xml:space="preserve"> = </w:t>
-      </w:r>
-      <w:proofErr w:type="spellStart"/>
-      <w:r>
-        <w:t>functioncall</w:t>
-      </w:r>
-      <w:proofErr w:type="spellEnd"/>
-      <w:r>
-        <w:t>(</w:t>
-      </w:r>
-      <w:proofErr w:type="spellStart"/>
-      <w:proofErr w:type="gramStart"/>
-      <w:r>
-        <w:t>node.left</w:t>
-      </w:r>
-      <w:proofErr w:type="spellEnd"/>
-      <w:proofErr w:type="gramEnd"/>
-      <w:r>
-        <w:t>)</w:t>
+      <w:r>
+        <w:t>Leftdepth = functioncall(node.left)</w:t>
       </w:r>
     </w:p>
     <w:p>
@@ -1107,31 +909,8 @@
         </w:tabs>
         <w:ind w:left="1440"/>
       </w:pPr>
-      <w:proofErr w:type="spellStart"/>
-      <w:r>
-        <w:t>Rightdepth</w:t>
-      </w:r>
-      <w:proofErr w:type="spellEnd"/>
-      <w:r>
-        <w:t xml:space="preserve"> = </w:t>
-      </w:r>
-      <w:proofErr w:type="spellStart"/>
-      <w:r>
-        <w:t>functioncall</w:t>
-      </w:r>
-      <w:proofErr w:type="spellEnd"/>
-      <w:r>
-        <w:t>(</w:t>
-      </w:r>
-      <w:proofErr w:type="spellStart"/>
-      <w:proofErr w:type="gramStart"/>
-      <w:r>
-        <w:t>node.right</w:t>
-      </w:r>
-      <w:proofErr w:type="spellEnd"/>
-      <w:proofErr w:type="gramEnd"/>
-      <w:r>
-        <w:t>)</w:t>
+      <w:r>
+        <w:t>Rightdepth = functioncall(node.right)</w:t>
       </w:r>
     </w:p>
     <w:p>
@@ -1144,28 +923,7 @@
         <w:ind w:left="1440"/>
       </w:pPr>
       <w:r>
-        <w:t xml:space="preserve">Return 1 + </w:t>
-      </w:r>
-      <w:proofErr w:type="gramStart"/>
-      <w:r>
-        <w:t>max(</w:t>
-      </w:r>
-      <w:proofErr w:type="spellStart"/>
-      <w:proofErr w:type="gramEnd"/>
-      <w:r>
-        <w:t>leftdepth</w:t>
-      </w:r>
-      <w:proofErr w:type="spellEnd"/>
-      <w:r>
-        <w:t xml:space="preserve"> + </w:t>
-      </w:r>
-      <w:proofErr w:type="spellStart"/>
-      <w:r>
-        <w:t>rightdepth</w:t>
-      </w:r>
-      <w:proofErr w:type="spellEnd"/>
-      <w:r>
-        <w:t>)</w:t>
+        <w:t>Return 1 + max(leftdepth + rightdepth)</w:t>
       </w:r>
     </w:p>
     <w:p>
@@ -1372,15 +1130,7 @@
         <w:pStyle w:val="ListBullet"/>
       </w:pPr>
       <w:r>
-        <w:t xml:space="preserve">Swapping two </w:t>
-      </w:r>
-      <w:proofErr w:type="gramStart"/>
-      <w:r>
-        <w:t>variable</w:t>
-      </w:r>
-      <w:proofErr w:type="gramEnd"/>
-      <w:r>
-        <w:t xml:space="preserve"> </w:t>
+        <w:t xml:space="preserve">Swapping two variable </w:t>
       </w:r>
     </w:p>
     <w:p>
@@ -1432,26 +1182,7 @@
         <w:ind w:left="360"/>
       </w:pPr>
       <w:r>
-        <w:t>o/</w:t>
-      </w:r>
-      <w:proofErr w:type="gramStart"/>
-      <w:r>
-        <w:t>p</w:t>
-      </w:r>
-      <w:r>
-        <w:t>:-</w:t>
-      </w:r>
-      <w:proofErr w:type="gramEnd"/>
-      <w:r>
-        <w:t xml:space="preserve"> A = </w:t>
-      </w:r>
-      <w:proofErr w:type="gramStart"/>
-      <w:r>
-        <w:t>2 ,</w:t>
-      </w:r>
-      <w:proofErr w:type="gramEnd"/>
-      <w:r>
-        <w:t xml:space="preserve"> B = 1</w:t>
+        <w:t>o/p:- A = 2 , B = 1</w:t>
       </w:r>
     </w:p>
     <w:p>
@@ -1481,13 +1212,16 @@
         <w:pStyle w:val="ListBullet"/>
       </w:pPr>
       <w:r>
-        <w:t>DFS(Recursive)</w:t>
-      </w:r>
-    </w:p>
-    <w:p>
-      <w:pPr>
-        <w:pStyle w:val="ListBullet"/>
-      </w:pPr>
+        <w:t>BFS(Iterative)</w:t>
+      </w:r>
+    </w:p>
+    <w:p>
+      <w:pPr>
+        <w:pStyle w:val="ListBullet"/>
+      </w:pPr>
+      <w:r>
+        <w:t xml:space="preserve">Tree </w:t>
+      </w:r>
     </w:p>
     <w:p>
       <w:pPr>
@@ -1498,6 +1232,11 @@
       </w:r>
     </w:p>
     <w:p>
+      <w:r>
+        <w:t xml:space="preserve">Check each node with the null element </w:t>
+      </w:r>
+    </w:p>
+    <w:p>
       <w:pPr>
         <w:pStyle w:val="Heading3"/>
       </w:pPr>
@@ -1506,6 +1245,11 @@
       </w:r>
     </w:p>
     <w:p>
+      <w:r>
+        <w:t xml:space="preserve">Do not group them by their indices </w:t>
+      </w:r>
+    </w:p>
+    <w:p>
       <w:pPr>
         <w:pStyle w:val="Heading3"/>
       </w:pPr>
@@ -1515,10 +1259,213 @@
     </w:p>
     <w:p>
       <w:pPr>
+        <w:pStyle w:val="ListBullet"/>
+      </w:pPr>
+      <w:r>
+        <w:t>If node is empty:</w:t>
+      </w:r>
+    </w:p>
+    <w:p>
+      <w:pPr>
+        <w:pStyle w:val="ListBullet"/>
+        <w:tabs>
+          <w:tab w:val="clear" w:pos="360"/>
+          <w:tab w:val="num" w:pos="720"/>
+        </w:tabs>
+        <w:ind w:left="720"/>
+      </w:pPr>
+      <w:r>
+        <w:t>Return [](empty list)</w:t>
+      </w:r>
+    </w:p>
+    <w:p>
+      <w:pPr>
+        <w:pStyle w:val="ListBullet"/>
+      </w:pPr>
+      <w:r>
+        <w:t>Put the node into dequeue</w:t>
+      </w:r>
+    </w:p>
+    <w:p>
+      <w:pPr>
+        <w:pStyle w:val="ListBullet"/>
+      </w:pPr>
+      <w:r>
+        <w:t>Define the answer list</w:t>
+      </w:r>
+    </w:p>
+    <w:p>
+      <w:pPr>
+        <w:pStyle w:val="ListBullet"/>
+      </w:pPr>
+      <w:r>
+        <w:t>While node is not empty:</w:t>
+      </w:r>
+    </w:p>
+    <w:p>
+      <w:pPr>
+        <w:pStyle w:val="ListBullet"/>
+        <w:tabs>
+          <w:tab w:val="clear" w:pos="360"/>
+          <w:tab w:val="num" w:pos="720"/>
+        </w:tabs>
+        <w:ind w:left="720"/>
+      </w:pPr>
+      <w:r>
+        <w:t>Define another list to store each level of tree</w:t>
+      </w:r>
+    </w:p>
+    <w:p>
+      <w:pPr>
+        <w:pStyle w:val="ListBullet"/>
+        <w:tabs>
+          <w:tab w:val="clear" w:pos="360"/>
+          <w:tab w:val="num" w:pos="720"/>
+        </w:tabs>
+        <w:ind w:left="720"/>
+      </w:pPr>
+      <w:r>
+        <w:t xml:space="preserve">A loop to run through each level </w:t>
+      </w:r>
+    </w:p>
+    <w:p>
+      <w:pPr>
+        <w:pStyle w:val="ListBullet"/>
+        <w:tabs>
+          <w:tab w:val="clear" w:pos="360"/>
+          <w:tab w:val="num" w:pos="1080"/>
+        </w:tabs>
+        <w:ind w:left="1080"/>
+      </w:pPr>
+      <w:r>
+        <w:t>Pop the last element from the node because each node is a class</w:t>
+      </w:r>
+    </w:p>
+    <w:p>
+      <w:pPr>
+        <w:pStyle w:val="ListBullet"/>
+        <w:tabs>
+          <w:tab w:val="clear" w:pos="360"/>
+          <w:tab w:val="num" w:pos="1080"/>
+        </w:tabs>
+        <w:ind w:left="1080"/>
+      </w:pPr>
+      <w:r>
+        <w:t xml:space="preserve">Check if it have the left element </w:t>
+      </w:r>
+    </w:p>
+    <w:p>
+      <w:pPr>
+        <w:pStyle w:val="ListBullet"/>
+        <w:tabs>
+          <w:tab w:val="clear" w:pos="360"/>
+          <w:tab w:val="num" w:pos="1440"/>
+        </w:tabs>
+        <w:ind w:left="1440"/>
+      </w:pPr>
+      <w:r>
+        <w:t>Append it to the list of level</w:t>
+      </w:r>
+    </w:p>
+    <w:p>
+      <w:pPr>
+        <w:pStyle w:val="ListBullet"/>
+        <w:tabs>
+          <w:tab w:val="clear" w:pos="360"/>
+          <w:tab w:val="num" w:pos="1080"/>
+        </w:tabs>
+        <w:ind w:left="1080"/>
+      </w:pPr>
+      <w:r>
+        <w:t xml:space="preserve">Check the right element </w:t>
+      </w:r>
+    </w:p>
+    <w:p>
+      <w:pPr>
+        <w:pStyle w:val="ListBullet"/>
+        <w:tabs>
+          <w:tab w:val="clear" w:pos="360"/>
+          <w:tab w:val="num" w:pos="1440"/>
+        </w:tabs>
+        <w:ind w:left="1440"/>
+      </w:pPr>
+      <w:r>
+        <w:t xml:space="preserve">Append it to the list </w:t>
+      </w:r>
+    </w:p>
+    <w:p>
+      <w:pPr>
+        <w:pStyle w:val="ListBullet"/>
+      </w:pPr>
+      <w:r>
+        <w:t>Append the level to the answer</w:t>
+      </w:r>
+    </w:p>
+    <w:p>
+      <w:pPr>
         <w:pStyle w:val="Heading3"/>
       </w:pPr>
       <w:r>
         <w:t>Edge Cases:</w:t>
+      </w:r>
+    </w:p>
+    <w:p>
+      <w:r>
+        <w:t>Always check the left and right element as it is a list and the both elements are given in the class</w:t>
+      </w:r>
+    </w:p>
+    <w:p>
+      <w:r>
+        <w:br w:type="page"/>
+      </w:r>
+    </w:p>
+    <w:p>
+      <w:pPr>
+        <w:pStyle w:val="Heading2"/>
+      </w:pPr>
+      <w:r>
+        <w:lastRenderedPageBreak/>
+        <w:t>LC 200. Number of island</w:t>
+      </w:r>
+    </w:p>
+    <w:p>
+      <w:pPr>
+        <w:pStyle w:val="Heading3"/>
+      </w:pPr>
+      <w:r>
+        <w:t>Pattern:</w:t>
+      </w:r>
+    </w:p>
+    <w:p>
+      <w:pPr>
+        <w:pStyle w:val="Heading3"/>
+      </w:pPr>
+      <w:r>
+        <w:t>Invariant:</w:t>
+      </w:r>
+    </w:p>
+    <w:p>
+      <w:pPr>
+        <w:pStyle w:val="Heading3"/>
+      </w:pPr>
+      <w:r>
+        <w:t>Why Naïve fails:</w:t>
+      </w:r>
+    </w:p>
+    <w:p>
+      <w:pPr>
+        <w:pStyle w:val="Heading3"/>
+      </w:pPr>
+      <w:r>
+        <w:t>Decision Rules:</w:t>
+      </w:r>
+    </w:p>
+    <w:p>
+      <w:pPr>
+        <w:pStyle w:val="Heading3"/>
+      </w:pPr>
+      <w:r>
+        <w:t>Edge cases:</w:t>
       </w:r>
     </w:p>
     <w:sectPr>

</xml_diff>